<commit_message>
Word export: combined document renamed Migration-Governance-Global.docx
Co-Authored-By: Claude Opus 5.5 <noreply@anthropic.com>
</commit_message>
<xml_diff>
--- a/migration-governance/word/Governance-Guide.docx
+++ b/migration-governance/word/Governance-Guide.docx
@@ -12818,14 +12818,24 @@
       </w:r>
       <w:r>
         <w:rPr/>
-        <w:t xml:space="preserve"> (for reading offline, printing, or sending): </w:t>
+        <w:t xml:space="preserve"> (for reading offline, printing, or sending): the </w:t>
+      </w:r>
+      <w:r>
+        <w:rPr>
+          <w:b/>
+        </w:rPr>
+        <w:t xml:space="preserve">global</w:t>
+      </w:r>
+      <w:r>
+        <w:rPr/>
+        <w:t xml:space="preserve"> document with all guides in one file, </w:t>
       </w:r>
       <w:r>
         <w:rPr>
           <w:color w:val="1B4A78"/>
           <w:u w:val="single"/>
         </w:rPr>
-        <w:t xml:space="preserve">all guides in one file</w:t>
+        <w:t xml:space="preserve">Migration-Governance-Global.docx</w:t>
       </w:r>
       <w:r>
         <w:rPr/>
@@ -12897,7 +12907,7 @@
                 <w:sz w:val="17"/>
                 <w:szCs w:val="17"/>
               </w:rPr>
-              <w:t xml:space="preserve">perl tools/md2docx.pl word/Migration-Governance.docx README.md SYSADMIN.md DBA.md SCRIPTS-AND-VSCODE.md SERVER-PAGE-TEMPLATE.md</w:t>
+              <w:t xml:space="preserve">perl tools/md2docx.pl word/Migration-Governance-Global.docx README.md SYSADMIN.md DBA.md SCRIPTS-AND-VSCODE.md SERVER-PAGE-TEMPLATE.md</w:t>
             </w:r>
           </w:p>
           <w:p>

</xml_diff>

<commit_message>
Governance guide: paste the server page template into Loop from GitHub, not Word; guides are linked, not pasted
Co-Authored-By: Claude Opus 5.5 <noreply@anthropic.com>
</commit_message>
<xml_diff>
--- a/migration-governance/word/Governance-Guide.docx
+++ b/migration-governance/word/Governance-Guide.docx
@@ -11631,7 +11631,17 @@
       <w:pPr/>
       <w:r>
         <w:rPr/>
-        <w:t xml:space="preserve">Loop can't import a file, but it keeps formatting when you paste. To use the template in Microsoft Loop:</w:t>
+        <w:t xml:space="preserve">Loop can't import a file, and it only keeps </w:t>
+      </w:r>
+      <w:r>
+        <w:rPr>
+          <w:b/>
+        </w:rPr>
+        <w:t xml:space="preserve">basic formatting</w:t>
+      </w:r>
+      <w:r>
+        <w:rPr/>
+        <w:t xml:space="preserve"> when you paste: headings, bold, lists, checklists and plain tables. Colours, shading and fonts are lost. To use the template in Microsoft Loop:</w:t>
       </w:r>
     </w:p>
     <w:p>
@@ -11644,37 +11654,28 @@
       </w:pPr>
       <w:r>
         <w:rPr/>
-        <w:t xml:space="preserve">Open the </w:t>
+        <w:t xml:space="preserve">Open </w:t>
+      </w:r>
+      <w:r>
+        <w:rPr>
+          <w:color w:val="1B4A78"/>
+          <w:u w:val="single"/>
+        </w:rPr>
+        <w:t xml:space="preserve">SERVER-PAGE-TEMPLATE.md</w:t>
+      </w:r>
+      <w:r>
+        <w:rPr/>
+        <w:t xml:space="preserve"> </w:t>
       </w:r>
       <w:r>
         <w:rPr>
           <w:b/>
         </w:rPr>
-        <w:t xml:space="preserve">Word copy</w:t>
+        <w:t xml:space="preserve">on GitHub</w:t>
       </w:r>
       <w:r>
         <w:rPr/>
-        <w:t xml:space="preserve">, press </w:t>
-      </w:r>
-      <w:r>
-        <w:rPr>
-          <w:b/>
-        </w:rPr>
-        <w:t xml:space="preserve">Ctrl+A</w:t>
-      </w:r>
-      <w:r>
-        <w:rPr/>
-        <w:t xml:space="preserve"> and then </w:t>
-      </w:r>
-      <w:r>
-        <w:rPr>
-          <w:b/>
-        </w:rPr>
-        <w:t xml:space="preserve">Ctrl+C</w:t>
-      </w:r>
-      <w:r>
-        <w:rPr/>
-        <w:t xml:space="preserve">. Copying from the rendered GitHub page also works.</w:t>
+        <w:t xml:space="preserve">, so it shows rendered, then select the page and copy it.</w:t>
       </w:r>
     </w:p>
     <w:p>
@@ -11687,7 +11688,17 @@
       </w:pPr>
       <w:r>
         <w:rPr/>
-        <w:t xml:space="preserve">Paste it into a new Loop page. Headings, tables and lists are kept. The checkboxes (☐) arrive as text: type </w:t>
+        <w:t xml:space="preserve">Paste it into a new Loop page. </w:t>
+      </w:r>
+      <w:r>
+        <w:rPr>
+          <w:b/>
+        </w:rPr>
+        <w:t xml:space="preserve">Don't paste from the Word copy:</w:t>
+      </w:r>
+      <w:r>
+        <w:rPr/>
+        <w:t xml:space="preserve"> Word's clipboard format makes Loop lose the lists and headings. Check that the checklists came through; if not, type </w:t>
       </w:r>
       <w:r>
         <w:rPr>
@@ -11699,7 +11710,7 @@
       </w:r>
       <w:r>
         <w:rPr/>
-        <w:t xml:space="preserve"> at the start of those lines to turn them into Loop checklists.</w:t>
+        <w:t xml:space="preserve"> at the start of those lines.</w:t>
       </w:r>
     </w:p>
     <w:p>
@@ -11724,6 +11735,114 @@
         <w:rPr/>
         <w:t xml:space="preserve"> in the bundle's Loop workspace, so each server page starts from the same layout.</w:t>
       </w:r>
+    </w:p>
+    <w:tbl>
+      <w:tblPr>
+        <w:tblW w:w="10080" w:type="dxa"/>
+        <w:tblBorders>
+          <w:top w:val="nil"/>
+          <w:left w:val="nil"/>
+          <w:bottom w:val="nil"/>
+          <w:right w:val="nil"/>
+          <w:insideH w:val="nil"/>
+          <w:insideV w:val="nil"/>
+        </w:tblBorders>
+        <w:tblLayout w:type="fixed"/>
+        <w:tblCellMar>
+          <w:top w:w="100" w:type="dxa"/>
+          <w:left w:w="200" w:type="dxa"/>
+          <w:bottom w:w="100" w:type="dxa"/>
+          <w:right w:w="200" w:type="dxa"/>
+        </w:tblCellMar>
+      </w:tblPr>
+      <w:tblGrid>
+        <w:gridCol w:w="10080"/>
+      </w:tblGrid>
+      <w:tr>
+        <w:tc>
+          <w:tcPr>
+            <w:tcW w:w="10080" w:type="dxa"/>
+            <w:tcBorders>
+              <w:top w:val="single" w:sz="4" w:space="0" w:color="DDF4FF"/>
+              <w:left w:val="single" w:sz="24" w:space="0" w:color="0969DA"/>
+              <w:bottom w:val="single" w:sz="4" w:space="0" w:color="DDF4FF"/>
+              <w:right w:val="single" w:sz="4" w:space="0" w:color="DDF4FF"/>
+            </w:tcBorders>
+            <w:shd w:val="clear" w:color="auto" w:fill="DDF4FF"/>
+            <w:vAlign w:val="top"/>
+          </w:tcPr>
+          <w:p>
+            <w:pPr>
+              <w:pStyle w:val="TableText"/>
+              <w:spacing w:before="0" w:after="40"/>
+            </w:pPr>
+            <w:r>
+              <w:rPr>
+                <w:b/>
+                <w:caps/>
+                <w:color w:val="0969DA"/>
+                <w:spacing w:val="20"/>
+                <w:sz w:val="17"/>
+                <w:szCs w:val="17"/>
+              </w:rPr>
+              <w:t xml:space="preserve">Note</w:t>
+            </w:r>
+          </w:p>
+          <w:p>
+            <w:pPr>
+              <w:pStyle w:val="TableText"/>
+            </w:pPr>
+            <w:r>
+              <w:rPr>
+                <w:b/>
+              </w:rPr>
+              <w:t xml:space="preserve">The guides don't go into Loop.</w:t>
+            </w:r>
+            <w:r>
+              <w:rPr/>
+              <w:t xml:space="preserve"> Their layout (colours, diagrams, matrix) can't exist there. The Loop workspace home page </w:t>
+            </w:r>
+            <w:r>
+              <w:rPr>
+                <w:b/>
+              </w:rPr>
+              <w:t xml:space="preserve">links</w:t>
+            </w:r>
+            <w:r>
+              <w:rPr/>
+              <w:t xml:space="preserve"> to them on GitHub, or to the Word copies in </w:t>
+            </w:r>
+            <w:r>
+              <w:rPr>
+                <w:rFonts w:ascii="Consolas" w:hAnsi="Consolas" w:cs="Consolas"/>
+                <w:color w:val="A0303B"/>
+                <w:shd w:val="clear" w:color="auto" w:fill="F3F4F6"/>
+              </w:rPr>
+              <w:t xml:space="preserve">word/</w:t>
+            </w:r>
+            <w:r>
+              <w:rPr/>
+              <w:t xml:space="preserve"> (</w:t>
+            </w:r>
+            <w:r>
+              <w:rPr>
+                <w:color w:val="1B4A78"/>
+                <w:u w:val="single"/>
+              </w:rPr>
+              <w:t xml:space="preserve">4.3</w:t>
+            </w:r>
+            <w:r>
+              <w:rPr/>
+              <w:t xml:space="preserve">).</w:t>
+            </w:r>
+          </w:p>
+        </w:tc>
+      </w:tr>
+    </w:tbl>
+    <w:p>
+      <w:pPr>
+        <w:pStyle w:val="Spacer"/>
+      </w:pPr>
     </w:p>
     <w:p>
       <w:pPr>

</xml_diff>